<commit_message>
Updating Stakeholder Engagement Plan
</commit_message>
<xml_diff>
--- a/Project Planning, Requirements, and System Design/Stakeholder Engagement Plan.docx
+++ b/Project Planning, Requirements, and System Design/Stakeholder Engagement Plan.docx
@@ -525,7 +525,7 @@
               <w:rPr>
                 <w:rFonts w:ascii="Arial" w:hAnsi="Arial" w:cs="Arial"/>
               </w:rPr>
-              <w:t>University of Regina</w:t>
+              <w:t>Project Team</w:t>
             </w:r>
           </w:p>
         </w:tc>
@@ -556,31 +556,7 @@
               <w:rPr>
                 <w:rFonts w:ascii="Arial" w:hAnsi="Arial" w:cs="Arial"/>
               </w:rPr>
-              <w:t>-Includes University of Regina faculty members</w:t>
-            </w:r>
-          </w:p>
-          <w:p>
-            <w:pPr>
-              <w:widowControl w:val="0"/>
-              <w:spacing w:after="0" w:line="240" w:lineRule="auto"/>
-              <w:rPr>
-                <w:rFonts w:ascii="Arial" w:hAnsi="Arial" w:cs="Arial"/>
-              </w:rPr>
-            </w:pPr>
-          </w:p>
-          <w:p>
-            <w:pPr>
-              <w:widowControl w:val="0"/>
-              <w:spacing w:after="0" w:line="240" w:lineRule="auto"/>
-              <w:rPr>
-                <w:rFonts w:ascii="Arial" w:hAnsi="Arial" w:cs="Arial"/>
-              </w:rPr>
-            </w:pPr>
-            <w:r>
-              <w:rPr>
-                <w:rFonts w:ascii="Arial" w:hAnsi="Arial" w:cs="Arial"/>
-              </w:rPr>
-              <w:t>-Will likely require administrator access should the project be officially integrated.</w:t>
+              <w:t>-Main team behind the project’s creation</w:t>
             </w:r>
           </w:p>
         </w:tc>
@@ -597,55 +573,47 @@
               <w:spacing w:line="240" w:lineRule="auto"/>
               <w:rPr>
                 <w:rFonts w:ascii="Arial" w:hAnsi="Arial" w:cs="Arial"/>
-              </w:rPr>
-            </w:pPr>
-            <w:r>
-              <w:rPr>
-                <w:rFonts w:ascii="Arial" w:hAnsi="Arial" w:cs="Arial"/>
                 <w:b/>
                 <w:bCs/>
               </w:rPr>
-              <w:t>Meet requirements</w:t>
-            </w:r>
-            <w:r>
-              <w:rPr>
-                <w:rFonts w:ascii="Arial" w:hAnsi="Arial" w:cs="Arial"/>
-              </w:rPr>
-              <w:t xml:space="preserve">: </w:t>
-            </w:r>
-          </w:p>
-          <w:p>
-            <w:pPr>
-              <w:widowControl w:val="0"/>
-              <w:spacing w:line="240" w:lineRule="auto"/>
-              <w:rPr>
-                <w:rFonts w:ascii="Arial" w:hAnsi="Arial" w:cs="Arial"/>
-              </w:rPr>
-            </w:pPr>
-            <w:r>
-              <w:rPr>
-                <w:rFonts w:ascii="Arial" w:hAnsi="Arial" w:cs="Arial"/>
-              </w:rPr>
-              <w:t>-If this project is officially integrated, it must first meet their requirements.</w:t>
-            </w:r>
-          </w:p>
-          <w:p>
-            <w:pPr>
-              <w:widowControl w:val="0"/>
-              <w:spacing w:line="240" w:lineRule="auto"/>
+            </w:pPr>
+            <w:r>
               <w:rPr>
                 <w:rFonts w:ascii="Arial" w:hAnsi="Arial" w:cs="Arial"/>
                 <w:b/>
                 <w:bCs/>
               </w:rPr>
-            </w:pPr>
-            <w:r>
-              <w:rPr>
-                <w:rFonts w:ascii="Arial" w:hAnsi="Arial" w:cs="Arial"/>
-                <w:b/>
-                <w:bCs/>
-              </w:rPr>
-              <w:t xml:space="preserve"> </w:t>
+              <w:t>Provide information</w:t>
+            </w:r>
+          </w:p>
+          <w:p>
+            <w:pPr>
+              <w:widowControl w:val="0"/>
+              <w:spacing w:line="240" w:lineRule="auto"/>
+              <w:rPr>
+                <w:rFonts w:ascii="Arial" w:hAnsi="Arial" w:cs="Arial"/>
+              </w:rPr>
+            </w:pPr>
+            <w:r>
+              <w:rPr>
+                <w:rFonts w:ascii="Arial" w:hAnsi="Arial" w:cs="Arial"/>
+              </w:rPr>
+              <w:t>-Communication within the team is important for a coherent end product.</w:t>
+            </w:r>
+          </w:p>
+          <w:p>
+            <w:pPr>
+              <w:widowControl w:val="0"/>
+              <w:spacing w:line="240" w:lineRule="auto"/>
+              <w:rPr>
+                <w:rFonts w:ascii="Arial" w:hAnsi="Arial" w:cs="Arial"/>
+              </w:rPr>
+            </w:pPr>
+            <w:r>
+              <w:rPr>
+                <w:rFonts w:ascii="Arial" w:hAnsi="Arial" w:cs="Arial"/>
+              </w:rPr>
+              <w:t>-Using services such as Git and GitHub to share progress with the rest of the team.</w:t>
             </w:r>
           </w:p>
         </w:tc>
@@ -680,7 +648,7 @@
               <w:rPr>
                 <w:rFonts w:ascii="Arial" w:hAnsi="Arial" w:cs="Arial"/>
               </w:rPr>
-              <w:t>U of R club organizers</w:t>
+              <w:t>University of Regina</w:t>
             </w:r>
           </w:p>
         </w:tc>
@@ -711,131 +679,32 @@
               <w:rPr>
                 <w:rFonts w:ascii="Arial" w:hAnsi="Arial" w:cs="Arial"/>
               </w:rPr>
-              <w:t xml:space="preserve">-Includes any </w:t>
-            </w:r>
-            <w:r>
-              <w:rPr>
-                <w:rFonts w:ascii="Arial" w:hAnsi="Arial" w:cs="Arial"/>
-              </w:rPr>
-              <w:t xml:space="preserve">club leaders or organizers </w:t>
-            </w:r>
-            <w:r>
-              <w:rPr>
-                <w:rFonts w:ascii="Arial" w:hAnsi="Arial" w:cs="Arial"/>
-              </w:rPr>
-              <w:t>that are interested in using UR Involved.</w:t>
-            </w:r>
-            <w:r>
-              <w:rPr>
-                <w:rFonts w:ascii="Arial" w:hAnsi="Arial" w:cs="Arial"/>
-              </w:rPr>
-              <w:t xml:space="preserve"> </w:t>
-            </w:r>
-          </w:p>
-          <w:p>
-            <w:pPr>
-              <w:widowControl w:val="0"/>
-              <w:spacing w:after="0" w:line="240" w:lineRule="auto"/>
-              <w:rPr>
-                <w:rFonts w:ascii="Arial" w:hAnsi="Arial" w:cs="Arial"/>
-              </w:rPr>
-            </w:pPr>
-          </w:p>
-          <w:p>
-            <w:pPr>
-              <w:widowControl w:val="0"/>
-              <w:spacing w:after="0" w:line="240" w:lineRule="auto"/>
-              <w:rPr>
-                <w:rFonts w:ascii="Arial" w:hAnsi="Arial" w:cs="Arial"/>
-              </w:rPr>
-            </w:pPr>
-            <w:r>
-              <w:rPr>
-                <w:rFonts w:ascii="Arial" w:hAnsi="Arial" w:cs="Arial"/>
-              </w:rPr>
-              <w:t>-Requires the ability to directly manage their club, including adding new members, scheduling events, etc.</w:t>
-            </w:r>
-          </w:p>
-          <w:p>
-            <w:pPr>
-              <w:widowControl w:val="0"/>
-              <w:spacing w:after="0" w:line="240" w:lineRule="auto"/>
-              <w:rPr>
-                <w:rFonts w:ascii="Arial" w:hAnsi="Arial" w:cs="Arial"/>
-              </w:rPr>
-            </w:pPr>
-          </w:p>
-          <w:p>
-            <w:pPr>
-              <w:widowControl w:val="0"/>
-              <w:spacing w:after="0" w:line="240" w:lineRule="auto"/>
-              <w:rPr>
-                <w:rFonts w:ascii="Arial" w:hAnsi="Arial" w:cs="Arial"/>
-              </w:rPr>
-            </w:pPr>
-          </w:p>
-          <w:p>
-            <w:pPr>
-              <w:widowControl w:val="0"/>
-              <w:spacing w:after="0" w:line="240" w:lineRule="auto"/>
-              <w:rPr>
-                <w:rFonts w:ascii="Arial" w:hAnsi="Arial" w:cs="Arial"/>
-              </w:rPr>
-            </w:pPr>
-          </w:p>
-          <w:p>
-            <w:pPr>
-              <w:widowControl w:val="0"/>
-              <w:spacing w:after="0" w:line="240" w:lineRule="auto"/>
-              <w:rPr>
-                <w:rFonts w:ascii="Arial" w:hAnsi="Arial" w:cs="Arial"/>
-              </w:rPr>
-            </w:pPr>
-          </w:p>
-          <w:p>
-            <w:pPr>
-              <w:widowControl w:val="0"/>
-              <w:spacing w:after="0" w:line="240" w:lineRule="auto"/>
-              <w:rPr>
-                <w:rFonts w:ascii="Arial" w:hAnsi="Arial" w:cs="Arial"/>
-              </w:rPr>
-            </w:pPr>
-          </w:p>
-          <w:p>
-            <w:pPr>
-              <w:widowControl w:val="0"/>
-              <w:spacing w:after="0" w:line="240" w:lineRule="auto"/>
-              <w:rPr>
-                <w:rFonts w:ascii="Arial" w:hAnsi="Arial" w:cs="Arial"/>
-              </w:rPr>
-            </w:pPr>
-          </w:p>
-          <w:p>
-            <w:pPr>
-              <w:widowControl w:val="0"/>
-              <w:spacing w:after="0" w:line="240" w:lineRule="auto"/>
-              <w:rPr>
-                <w:rFonts w:ascii="Arial" w:hAnsi="Arial" w:cs="Arial"/>
-              </w:rPr>
-            </w:pPr>
-          </w:p>
-          <w:p>
-            <w:pPr>
-              <w:widowControl w:val="0"/>
-              <w:spacing w:after="0" w:line="240" w:lineRule="auto"/>
-              <w:rPr>
-                <w:rFonts w:ascii="Arial" w:hAnsi="Arial" w:cs="Arial"/>
-              </w:rPr>
-            </w:pPr>
-          </w:p>
-          <w:p>
-            <w:pPr>
-              <w:widowControl w:val="0"/>
-              <w:spacing w:after="0" w:line="240" w:lineRule="auto"/>
-              <w:rPr>
-                <w:rFonts w:ascii="Arial" w:hAnsi="Arial" w:cs="Arial"/>
-              </w:rPr>
-            </w:pPr>
+              <w:t>-Includes University of Regina faculty members</w:t>
+            </w:r>
+          </w:p>
+          <w:p>
+            <w:pPr>
+              <w:widowControl w:val="0"/>
+              <w:spacing w:after="0" w:line="240" w:lineRule="auto"/>
+              <w:rPr>
+                <w:rFonts w:ascii="Arial" w:hAnsi="Arial" w:cs="Arial"/>
+              </w:rPr>
+            </w:pPr>
+          </w:p>
+          <w:p>
+            <w:pPr>
+              <w:widowControl w:val="0"/>
+              <w:spacing w:after="0" w:line="240" w:lineRule="auto"/>
+              <w:rPr>
+                <w:rFonts w:ascii="Arial" w:hAnsi="Arial" w:cs="Arial"/>
+              </w:rPr>
+            </w:pPr>
+            <w:r>
+              <w:rPr>
+                <w:rFonts w:ascii="Arial" w:hAnsi="Arial" w:cs="Arial"/>
+              </w:rPr>
+              <w:t>-Will likely require administrator access should the project be officially integrated.</w:t>
+            </w:r>
           </w:p>
         </w:tc>
         <w:tc>
@@ -856,49 +725,16 @@
             <w:r>
               <w:rPr>
                 <w:rFonts w:ascii="Arial" w:hAnsi="Arial" w:cs="Arial"/>
-              </w:rPr>
-              <w:t xml:space="preserve"> </w:t>
-            </w:r>
-            <w:r>
-              <w:rPr>
-                <w:rFonts w:ascii="Arial" w:hAnsi="Arial" w:cs="Arial"/>
                 <w:b/>
                 <w:bCs/>
               </w:rPr>
-              <w:t>Provide information</w:t>
-            </w:r>
-            <w:r>
-              <w:rPr>
-                <w:rFonts w:ascii="Arial" w:hAnsi="Arial" w:cs="Arial"/>
-              </w:rPr>
-              <w:t>:</w:t>
-            </w:r>
-          </w:p>
-          <w:p>
-            <w:pPr>
-              <w:widowControl w:val="0"/>
-              <w:spacing w:after="0" w:line="240" w:lineRule="auto"/>
-              <w:rPr>
-                <w:rFonts w:ascii="Arial" w:hAnsi="Arial" w:cs="Arial"/>
-              </w:rPr>
-            </w:pPr>
-            <w:r>
-              <w:rPr>
-                <w:rFonts w:ascii="Arial" w:hAnsi="Arial" w:cs="Arial"/>
-              </w:rPr>
-              <w:t>-</w:t>
-            </w:r>
-            <w:r>
-              <w:rPr>
-                <w:rFonts w:ascii="Arial" w:hAnsi="Arial" w:cs="Arial"/>
-              </w:rPr>
-              <w:t xml:space="preserve">Will need to be contacted at some point about </w:t>
-            </w:r>
-            <w:r>
-              <w:rPr>
-                <w:rFonts w:ascii="Arial" w:hAnsi="Arial" w:cs="Arial"/>
-              </w:rPr>
-              <w:t>their interest in adding their club to the system.</w:t>
+              <w:t>Meet requirements</w:t>
+            </w:r>
+            <w:r>
+              <w:rPr>
+                <w:rFonts w:ascii="Arial" w:hAnsi="Arial" w:cs="Arial"/>
+              </w:rPr>
+              <w:t xml:space="preserve">: </w:t>
             </w:r>
           </w:p>
           <w:p>
@@ -909,6 +745,12 @@
                 <w:rFonts w:ascii="Arial" w:hAnsi="Arial" w:cs="Arial"/>
               </w:rPr>
             </w:pPr>
+            <w:r>
+              <w:rPr>
+                <w:rFonts w:ascii="Arial" w:hAnsi="Arial" w:cs="Arial"/>
+              </w:rPr>
+              <w:t>-If this project is officially integrated, it must first meet their requirements.</w:t>
+            </w:r>
           </w:p>
           <w:p>
             <w:pPr>
@@ -916,44 +758,18 @@
               <w:spacing w:line="240" w:lineRule="auto"/>
               <w:rPr>
                 <w:rFonts w:ascii="Arial" w:hAnsi="Arial" w:cs="Arial"/>
-              </w:rPr>
-            </w:pPr>
-          </w:p>
-          <w:p>
-            <w:pPr>
-              <w:widowControl w:val="0"/>
-              <w:spacing w:line="240" w:lineRule="auto"/>
-              <w:rPr>
-                <w:rFonts w:ascii="Arial" w:hAnsi="Arial" w:cs="Arial"/>
-              </w:rPr>
-            </w:pPr>
-          </w:p>
-          <w:p>
-            <w:pPr>
-              <w:widowControl w:val="0"/>
-              <w:spacing w:line="240" w:lineRule="auto"/>
-              <w:rPr>
-                <w:rFonts w:ascii="Arial" w:hAnsi="Arial" w:cs="Arial"/>
-              </w:rPr>
-            </w:pPr>
-          </w:p>
-          <w:p>
-            <w:pPr>
-              <w:widowControl w:val="0"/>
-              <w:spacing w:line="240" w:lineRule="auto"/>
-              <w:rPr>
-                <w:rFonts w:ascii="Arial" w:hAnsi="Arial" w:cs="Arial"/>
-              </w:rPr>
-            </w:pPr>
-          </w:p>
-          <w:p>
-            <w:pPr>
-              <w:widowControl w:val="0"/>
-              <w:spacing w:line="240" w:lineRule="auto"/>
-              <w:rPr>
-                <w:rFonts w:ascii="Arial" w:hAnsi="Arial" w:cs="Arial"/>
-              </w:rPr>
-            </w:pPr>
+                <w:b/>
+                <w:bCs/>
+              </w:rPr>
+            </w:pPr>
+            <w:r>
+              <w:rPr>
+                <w:rFonts w:ascii="Arial" w:hAnsi="Arial" w:cs="Arial"/>
+                <w:b/>
+                <w:bCs/>
+              </w:rPr>
+              <w:t xml:space="preserve"> </w:t>
+            </w:r>
           </w:p>
         </w:tc>
       </w:tr>
@@ -987,8 +803,7 @@
               <w:rPr>
                 <w:rFonts w:ascii="Arial" w:hAnsi="Arial" w:cs="Arial"/>
               </w:rPr>
-              <w:lastRenderedPageBreak/>
-              <w:t>U of R student body</w:t>
+              <w:t>U of R club organizers</w:t>
             </w:r>
           </w:p>
         </w:tc>
@@ -1019,91 +834,49 @@
               <w:rPr>
                 <w:rFonts w:ascii="Arial" w:hAnsi="Arial" w:cs="Arial"/>
               </w:rPr>
-              <w:t>-Includes any students that would benefit from easier access to club information.</w:t>
-            </w:r>
-          </w:p>
-          <w:p>
-            <w:pPr>
-              <w:widowControl w:val="0"/>
-              <w:spacing w:after="0" w:line="240" w:lineRule="auto"/>
-              <w:rPr>
-                <w:rFonts w:ascii="Arial" w:hAnsi="Arial" w:cs="Arial"/>
-              </w:rPr>
-            </w:pPr>
-          </w:p>
-          <w:p>
-            <w:pPr>
-              <w:widowControl w:val="0"/>
-              <w:spacing w:after="0" w:line="240" w:lineRule="auto"/>
-              <w:rPr>
-                <w:rFonts w:ascii="Arial" w:hAnsi="Arial" w:cs="Arial"/>
-              </w:rPr>
-            </w:pPr>
-            <w:r>
-              <w:rPr>
-                <w:rFonts w:ascii="Arial" w:hAnsi="Arial" w:cs="Arial"/>
-              </w:rPr>
-              <w:t>-This refers</w:t>
-            </w:r>
-            <w:r>
-              <w:rPr>
-                <w:rFonts w:ascii="Arial" w:hAnsi="Arial" w:cs="Arial"/>
-              </w:rPr>
-              <w:t xml:space="preserve"> to</w:t>
-            </w:r>
-            <w:r>
-              <w:rPr>
-                <w:rFonts w:ascii="Arial" w:hAnsi="Arial" w:cs="Arial"/>
-              </w:rPr>
-              <w:t xml:space="preserve"> both current club members and those looking to join a club.</w:t>
-            </w:r>
-          </w:p>
-          <w:p>
-            <w:pPr>
-              <w:widowControl w:val="0"/>
-              <w:spacing w:after="0" w:line="240" w:lineRule="auto"/>
-              <w:rPr>
-                <w:rFonts w:ascii="Arial" w:hAnsi="Arial" w:cs="Arial"/>
-              </w:rPr>
-            </w:pPr>
-          </w:p>
-          <w:p>
-            <w:pPr>
-              <w:widowControl w:val="0"/>
-              <w:spacing w:after="0" w:line="240" w:lineRule="auto"/>
-              <w:rPr>
-                <w:rFonts w:ascii="Arial" w:hAnsi="Arial" w:cs="Arial"/>
-              </w:rPr>
-            </w:pPr>
-            <w:r>
-              <w:rPr>
-                <w:rFonts w:ascii="Arial" w:hAnsi="Arial" w:cs="Arial"/>
-              </w:rPr>
-              <w:t>-Requires the ability to ask to join a club, along with seeing club information.</w:t>
-            </w:r>
-          </w:p>
-          <w:p>
-            <w:pPr>
-              <w:widowControl w:val="0"/>
-              <w:spacing w:after="0" w:line="240" w:lineRule="auto"/>
-              <w:rPr>
-                <w:rFonts w:ascii="Arial" w:hAnsi="Arial" w:cs="Arial"/>
-              </w:rPr>
-            </w:pPr>
-          </w:p>
-          <w:p>
-            <w:pPr>
-              <w:widowControl w:val="0"/>
-              <w:spacing w:after="0" w:line="240" w:lineRule="auto"/>
-              <w:rPr>
-                <w:rFonts w:ascii="Arial" w:hAnsi="Arial" w:cs="Arial"/>
-              </w:rPr>
-            </w:pPr>
-            <w:r>
-              <w:rPr>
-                <w:rFonts w:ascii="Arial" w:hAnsi="Arial" w:cs="Arial"/>
-              </w:rPr>
-              <w:t>-For the purposes of creating this project, will be represented by students in Dr. Maciag’s class.</w:t>
+              <w:t xml:space="preserve">-Includes any </w:t>
+            </w:r>
+            <w:r>
+              <w:rPr>
+                <w:rFonts w:ascii="Arial" w:hAnsi="Arial" w:cs="Arial"/>
+              </w:rPr>
+              <w:t xml:space="preserve">club leaders or organizers </w:t>
+            </w:r>
+            <w:r>
+              <w:rPr>
+                <w:rFonts w:ascii="Arial" w:hAnsi="Arial" w:cs="Arial"/>
+              </w:rPr>
+              <w:t>that are interested in using UR Involved.</w:t>
+            </w:r>
+            <w:r>
+              <w:rPr>
+                <w:rFonts w:ascii="Arial" w:hAnsi="Arial" w:cs="Arial"/>
+              </w:rPr>
+              <w:t xml:space="preserve"> </w:t>
+            </w:r>
+          </w:p>
+          <w:p>
+            <w:pPr>
+              <w:widowControl w:val="0"/>
+              <w:spacing w:after="0" w:line="240" w:lineRule="auto"/>
+              <w:rPr>
+                <w:rFonts w:ascii="Arial" w:hAnsi="Arial" w:cs="Arial"/>
+              </w:rPr>
+            </w:pPr>
+          </w:p>
+          <w:p>
+            <w:pPr>
+              <w:widowControl w:val="0"/>
+              <w:spacing w:after="0" w:line="240" w:lineRule="auto"/>
+              <w:rPr>
+                <w:rFonts w:ascii="Arial" w:hAnsi="Arial" w:cs="Arial"/>
+              </w:rPr>
+            </w:pPr>
+            <w:r>
+              <w:rPr>
+                <w:rFonts w:ascii="Arial" w:hAnsi="Arial" w:cs="Arial"/>
+              </w:rPr>
+              <w:t>-Requires the ability to directly manage their club, including adding new members, scheduling events, etc.</w:t>
             </w:r>
           </w:p>
           <w:p>
@@ -1143,6 +916,12 @@
             <w:r>
               <w:rPr>
                 <w:rFonts w:ascii="Arial" w:hAnsi="Arial" w:cs="Arial"/>
+              </w:rPr>
+              <w:t xml:space="preserve"> </w:t>
+            </w:r>
+            <w:r>
+              <w:rPr>
+                <w:rFonts w:ascii="Arial" w:hAnsi="Arial" w:cs="Arial"/>
                 <w:b/>
                 <w:bCs/>
               </w:rPr>
@@ -1158,28 +937,270 @@
           <w:p>
             <w:pPr>
               <w:widowControl w:val="0"/>
+              <w:spacing w:after="0" w:line="240" w:lineRule="auto"/>
+              <w:rPr>
+                <w:rFonts w:ascii="Arial" w:hAnsi="Arial" w:cs="Arial"/>
+              </w:rPr>
+            </w:pPr>
+            <w:r>
+              <w:rPr>
+                <w:rFonts w:ascii="Arial" w:hAnsi="Arial" w:cs="Arial"/>
+              </w:rPr>
+              <w:t>-</w:t>
+            </w:r>
+            <w:r>
+              <w:rPr>
+                <w:rFonts w:ascii="Arial" w:hAnsi="Arial" w:cs="Arial"/>
+              </w:rPr>
+              <w:t xml:space="preserve">Will need to be contacted at some point about </w:t>
+            </w:r>
+            <w:r>
+              <w:rPr>
+                <w:rFonts w:ascii="Arial" w:hAnsi="Arial" w:cs="Arial"/>
+              </w:rPr>
+              <w:t>their interest in adding their club to the system.</w:t>
+            </w:r>
+          </w:p>
+          <w:p>
+            <w:pPr>
+              <w:widowControl w:val="0"/>
               <w:spacing w:line="240" w:lineRule="auto"/>
               <w:rPr>
                 <w:rFonts w:ascii="Arial" w:hAnsi="Arial" w:cs="Arial"/>
               </w:rPr>
             </w:pPr>
-            <w:r>
-              <w:rPr>
-                <w:rFonts w:ascii="Arial" w:hAnsi="Arial" w:cs="Arial"/>
-              </w:rPr>
-              <w:t>-</w:t>
-            </w:r>
-            <w:r>
-              <w:rPr>
-                <w:rFonts w:ascii="Arial" w:hAnsi="Arial" w:cs="Arial"/>
-              </w:rPr>
-              <w:t xml:space="preserve">-Have project check ins with shareholder on </w:t>
-            </w:r>
-            <w:r>
-              <w:rPr>
-                <w:rFonts w:ascii="Arial" w:hAnsi="Arial" w:cs="Arial"/>
-              </w:rPr>
-              <w:t>dates specified below, last updated on March 6:</w:t>
+          </w:p>
+          <w:p>
+            <w:pPr>
+              <w:widowControl w:val="0"/>
+              <w:spacing w:line="240" w:lineRule="auto"/>
+              <w:rPr>
+                <w:rFonts w:ascii="Arial" w:hAnsi="Arial" w:cs="Arial"/>
+              </w:rPr>
+            </w:pPr>
+          </w:p>
+          <w:p>
+            <w:pPr>
+              <w:widowControl w:val="0"/>
+              <w:spacing w:line="240" w:lineRule="auto"/>
+              <w:rPr>
+                <w:rFonts w:ascii="Arial" w:hAnsi="Arial" w:cs="Arial"/>
+              </w:rPr>
+            </w:pPr>
+          </w:p>
+        </w:tc>
+      </w:tr>
+      <w:tr>
+        <w:trPr>
+          <w:trHeight w:val="400"/>
+        </w:trPr>
+        <w:tc>
+          <w:tcPr>
+            <w:tcW w:w="1975" w:type="dxa"/>
+            <w:tcBorders>
+              <w:right w:val="nil"/>
+            </w:tcBorders>
+            <w:shd w:val="clear" w:color="auto" w:fill="FFFFFF"/>
+            <w:tcMar>
+              <w:top w:w="100" w:type="dxa"/>
+              <w:left w:w="100" w:type="dxa"/>
+              <w:bottom w:w="100" w:type="dxa"/>
+              <w:right w:w="100" w:type="dxa"/>
+            </w:tcMar>
+          </w:tcPr>
+          <w:p>
+            <w:pPr>
+              <w:widowControl w:val="0"/>
+              <w:spacing w:after="0" w:line="240" w:lineRule="auto"/>
+              <w:rPr>
+                <w:rFonts w:ascii="Arial" w:hAnsi="Arial" w:cs="Arial"/>
+              </w:rPr>
+            </w:pPr>
+            <w:r>
+              <w:rPr>
+                <w:rFonts w:ascii="Arial" w:hAnsi="Arial" w:cs="Arial"/>
+              </w:rPr>
+              <w:lastRenderedPageBreak/>
+              <w:t>U of R student body</w:t>
+            </w:r>
+          </w:p>
+        </w:tc>
+        <w:tc>
+          <w:tcPr>
+            <w:tcW w:w="3544" w:type="dxa"/>
+            <w:tcBorders>
+              <w:left w:val="nil"/>
+              <w:right w:val="nil"/>
+            </w:tcBorders>
+            <w:shd w:val="clear" w:color="auto" w:fill="FFFFFF"/>
+            <w:tcMar>
+              <w:top w:w="100" w:type="dxa"/>
+              <w:left w:w="100" w:type="dxa"/>
+              <w:bottom w:w="100" w:type="dxa"/>
+              <w:right w:w="100" w:type="dxa"/>
+            </w:tcMar>
+          </w:tcPr>
+          <w:p>
+            <w:pPr>
+              <w:widowControl w:val="0"/>
+              <w:spacing w:after="0" w:line="240" w:lineRule="auto"/>
+              <w:rPr>
+                <w:rFonts w:ascii="Arial" w:hAnsi="Arial" w:cs="Arial"/>
+              </w:rPr>
+            </w:pPr>
+            <w:r>
+              <w:rPr>
+                <w:rFonts w:ascii="Arial" w:hAnsi="Arial" w:cs="Arial"/>
+              </w:rPr>
+              <w:t>-Includes any students that would benefit from easier access to club information.</w:t>
+            </w:r>
+          </w:p>
+          <w:p>
+            <w:pPr>
+              <w:widowControl w:val="0"/>
+              <w:spacing w:after="0" w:line="240" w:lineRule="auto"/>
+              <w:rPr>
+                <w:rFonts w:ascii="Arial" w:hAnsi="Arial" w:cs="Arial"/>
+              </w:rPr>
+            </w:pPr>
+          </w:p>
+          <w:p>
+            <w:pPr>
+              <w:widowControl w:val="0"/>
+              <w:spacing w:after="0" w:line="240" w:lineRule="auto"/>
+              <w:rPr>
+                <w:rFonts w:ascii="Arial" w:hAnsi="Arial" w:cs="Arial"/>
+              </w:rPr>
+            </w:pPr>
+            <w:r>
+              <w:rPr>
+                <w:rFonts w:ascii="Arial" w:hAnsi="Arial" w:cs="Arial"/>
+              </w:rPr>
+              <w:t>-This refers</w:t>
+            </w:r>
+            <w:r>
+              <w:rPr>
+                <w:rFonts w:ascii="Arial" w:hAnsi="Arial" w:cs="Arial"/>
+              </w:rPr>
+              <w:t xml:space="preserve"> to</w:t>
+            </w:r>
+            <w:r>
+              <w:rPr>
+                <w:rFonts w:ascii="Arial" w:hAnsi="Arial" w:cs="Arial"/>
+              </w:rPr>
+              <w:t xml:space="preserve"> both current club members and those looking to join a club.</w:t>
+            </w:r>
+          </w:p>
+          <w:p>
+            <w:pPr>
+              <w:widowControl w:val="0"/>
+              <w:spacing w:after="0" w:line="240" w:lineRule="auto"/>
+              <w:rPr>
+                <w:rFonts w:ascii="Arial" w:hAnsi="Arial" w:cs="Arial"/>
+              </w:rPr>
+            </w:pPr>
+          </w:p>
+          <w:p>
+            <w:pPr>
+              <w:widowControl w:val="0"/>
+              <w:spacing w:after="0" w:line="240" w:lineRule="auto"/>
+              <w:rPr>
+                <w:rFonts w:ascii="Arial" w:hAnsi="Arial" w:cs="Arial"/>
+              </w:rPr>
+            </w:pPr>
+            <w:r>
+              <w:rPr>
+                <w:rFonts w:ascii="Arial" w:hAnsi="Arial" w:cs="Arial"/>
+              </w:rPr>
+              <w:t>-Requires the ability to ask to join a club, along with seeing club information.</w:t>
+            </w:r>
+          </w:p>
+          <w:p>
+            <w:pPr>
+              <w:widowControl w:val="0"/>
+              <w:spacing w:after="0" w:line="240" w:lineRule="auto"/>
+              <w:rPr>
+                <w:rFonts w:ascii="Arial" w:hAnsi="Arial" w:cs="Arial"/>
+              </w:rPr>
+            </w:pPr>
+          </w:p>
+          <w:p>
+            <w:pPr>
+              <w:widowControl w:val="0"/>
+              <w:spacing w:after="0" w:line="240" w:lineRule="auto"/>
+              <w:rPr>
+                <w:rFonts w:ascii="Arial" w:hAnsi="Arial" w:cs="Arial"/>
+              </w:rPr>
+            </w:pPr>
+            <w:r>
+              <w:rPr>
+                <w:rFonts w:ascii="Arial" w:hAnsi="Arial" w:cs="Arial"/>
+              </w:rPr>
+              <w:t>-For the purposes of creating this project, will be represented by students in Dr. Maciag’s class.</w:t>
+            </w:r>
+          </w:p>
+          <w:p>
+            <w:pPr>
+              <w:widowControl w:val="0"/>
+              <w:spacing w:after="0" w:line="240" w:lineRule="auto"/>
+              <w:rPr>
+                <w:rFonts w:ascii="Arial" w:hAnsi="Arial" w:cs="Arial"/>
+              </w:rPr>
+            </w:pPr>
+          </w:p>
+          <w:p>
+            <w:pPr>
+              <w:widowControl w:val="0"/>
+              <w:spacing w:after="0" w:line="240" w:lineRule="auto"/>
+              <w:rPr>
+                <w:rFonts w:ascii="Arial" w:hAnsi="Arial" w:cs="Arial"/>
+              </w:rPr>
+            </w:pPr>
+          </w:p>
+        </w:tc>
+        <w:tc>
+          <w:tcPr>
+            <w:tcW w:w="4191" w:type="dxa"/>
+            <w:tcBorders>
+              <w:left w:val="nil"/>
+            </w:tcBorders>
+          </w:tcPr>
+          <w:p>
+            <w:pPr>
+              <w:widowControl w:val="0"/>
+              <w:spacing w:line="240" w:lineRule="auto"/>
+              <w:rPr>
+                <w:rFonts w:ascii="Arial" w:hAnsi="Arial" w:cs="Arial"/>
+              </w:rPr>
+            </w:pPr>
+            <w:r>
+              <w:rPr>
+                <w:rFonts w:ascii="Arial" w:hAnsi="Arial" w:cs="Arial"/>
+                <w:b/>
+                <w:bCs/>
+              </w:rPr>
+              <w:t>Provide information</w:t>
+            </w:r>
+            <w:r>
+              <w:rPr>
+                <w:rFonts w:ascii="Arial" w:hAnsi="Arial" w:cs="Arial"/>
+              </w:rPr>
+              <w:t>:</w:t>
+            </w:r>
+          </w:p>
+          <w:p>
+            <w:pPr>
+              <w:widowControl w:val="0"/>
+              <w:spacing w:line="240" w:lineRule="auto"/>
+              <w:rPr>
+                <w:rFonts w:ascii="Arial" w:hAnsi="Arial" w:cs="Arial"/>
+              </w:rPr>
+            </w:pPr>
+            <w:r>
+              <w:rPr>
+                <w:rFonts w:ascii="Arial" w:hAnsi="Arial" w:cs="Arial"/>
+              </w:rPr>
+              <w:t>--Have project check ins with shareholder on dates specified below, last updated on March 6:</w:t>
             </w:r>
           </w:p>
           <w:p>

</xml_diff>